<commit_message>
Fija la paginacion de las tres variantes con margen de seguridad
La variante Banda se iba a 3 paginas en Word: la previsualizacion usa
clones metricos (Carlito/Caladea) que igualan el ancho de caracter pero
no la altura de linea, y esa variante quedaba con solo 0,81 cm libres al
pie de la pagina 1.

- Nuevo criterio de afinado: ya no basta con cerrar en 2 paginas; se
  exige un minimo de 2,4 cm libres al pie de la pagina 1 (slack.py mide
  la holgura real desde el bounding box del texto).
- Banda: banda superior compacta y mayor medida de linea, para ganar
  espacio sin achicar la tipografia. Queda en 9,6 pt con 2,62 cm libres.
- Minimal: misma ganancia de medida. 9,1 pt con 2,43 cm libres.
- Sidebar: 9,3 pt con 2,46 cm libres.

Las tres cortan en el mismo punto: pagina 1 termina con Bmining completo.

Co-Authored-By: Claude Opus 5 <noreply@anthropic.com>
Claude-Session: https://claude.ai/code/session_01FQzQFNEQJbZhUnuA1Gqnqx
</commit_message>
<xml_diff>
--- a/cv-trabajador-social-uc/CV_Jeniffer_Mieres_01_Minimal.docx
+++ b/cv-trabajador-social-uc/CV_Jeniffer_Mieres_01_Minimal.docx
@@ -4,7 +4,7 @@
   <w:body>
     <w:p>
       <w:pPr>
-        <w:spacing w:before="0" w:after="60" w:line="269" w:lineRule="auto"/>
+        <w:spacing w:before="0" w:after="60" w:line="266" w:lineRule="auto"/>
       </w:pPr>
       <w:r>
         <w:rPr>
@@ -19,7 +19,7 @@
     </w:p>
     <w:p>
       <w:pPr>
-        <w:spacing w:before="0" w:after="140" w:line="269" w:lineRule="auto"/>
+        <w:spacing w:before="0" w:after="140" w:line="266" w:lineRule="auto"/>
       </w:pPr>
       <w:r>
         <w:rPr>
@@ -35,9 +35,9 @@
     <w:p>
       <w:pPr>
         <w:tabs>
-          <w:tab w:pos="10369" w:val="right"/>
+          <w:tab w:pos="10511" w:val="right"/>
         </w:tabs>
-        <w:spacing w:before="0" w:after="0" w:line="269" w:lineRule="auto"/>
+        <w:spacing w:before="0" w:after="0" w:line="266" w:lineRule="auto"/>
         <w:pBdr>
           <w:bottom w:val="single" w:sz="8" w:space="8" w:color="0D0D0D"/>
         </w:pBdr>
@@ -65,7 +65,7 @@
     <w:p>
       <w:pPr>
         <w:spacing w:before="120" w:after="0" w:line="240" w:lineRule="auto"/>
-        <w:ind w:right="9122"/>
+        <w:ind w:right="9264"/>
         <w:pBdr>
           <w:top w:val="single" w:sz="18" w:space="0" w:color="0D0D0D"/>
         </w:pBdr>
@@ -81,7 +81,7 @@
     <w:p>
       <w:pPr>
         <w:keepNext/>
-        <w:spacing w:before="100" w:after="120" w:line="269" w:lineRule="auto"/>
+        <w:spacing w:before="100" w:after="120" w:line="266" w:lineRule="auto"/>
       </w:pPr>
       <w:r>
         <w:rPr>
@@ -96,7 +96,7 @@
     </w:p>
     <w:p>
       <w:pPr>
-        <w:spacing w:before="0" w:after="0" w:line="269" w:lineRule="auto"/>
+        <w:spacing w:before="0" w:after="0" w:line="266" w:lineRule="auto"/>
         <w:jc w:val="both"/>
       </w:pPr>
       <w:r>
@@ -110,7 +110,7 @@
     </w:p>
     <w:p>
       <w:pPr>
-        <w:spacing w:before="54" w:after="0" w:line="269" w:lineRule="auto"/>
+        <w:spacing w:before="48" w:after="0" w:line="266" w:lineRule="auto"/>
         <w:jc w:val="both"/>
       </w:pPr>
       <w:r>
@@ -124,7 +124,7 @@
     </w:p>
     <w:p>
       <w:pPr>
-        <w:spacing w:before="54" w:after="0" w:line="269" w:lineRule="auto"/>
+        <w:spacing w:before="48" w:after="0" w:line="266" w:lineRule="auto"/>
         <w:jc w:val="both"/>
       </w:pPr>
       <w:r>
@@ -138,8 +138,8 @@
     </w:p>
     <w:p>
       <w:pPr>
-        <w:spacing w:before="150" w:after="0" w:line="240" w:lineRule="auto"/>
-        <w:ind w:right="9122"/>
+        <w:spacing w:before="130" w:after="0" w:line="240" w:lineRule="auto"/>
+        <w:ind w:right="9264"/>
         <w:pBdr>
           <w:top w:val="single" w:sz="18" w:space="0" w:color="0D0D0D"/>
         </w:pBdr>
@@ -155,7 +155,7 @@
     <w:p>
       <w:pPr>
         <w:keepNext/>
-        <w:spacing w:before="100" w:after="120" w:line="269" w:lineRule="auto"/>
+        <w:spacing w:before="100" w:after="120" w:line="266" w:lineRule="auto"/>
       </w:pPr>
       <w:r>
         <w:rPr>
@@ -170,7 +170,7 @@
     </w:p>
     <w:p>
       <w:pPr>
-        <w:spacing w:before="0" w:after="0" w:line="307" w:lineRule="auto"/>
+        <w:spacing w:before="0" w:after="0" w:line="305" w:lineRule="auto"/>
         <w:suppressAutoHyphens w:val="1"/>
       </w:pPr>
       <w:r>
@@ -337,8 +337,8 @@
     </w:p>
     <w:p>
       <w:pPr>
-        <w:spacing w:before="150" w:after="0" w:line="240" w:lineRule="auto"/>
-        <w:ind w:right="9122"/>
+        <w:spacing w:before="130" w:after="0" w:line="240" w:lineRule="auto"/>
+        <w:ind w:right="9264"/>
         <w:pBdr>
           <w:top w:val="single" w:sz="18" w:space="0" w:color="0D0D0D"/>
         </w:pBdr>
@@ -354,7 +354,7 @@
     <w:p>
       <w:pPr>
         <w:keepNext/>
-        <w:spacing w:before="100" w:after="120" w:line="269" w:lineRule="auto"/>
+        <w:spacing w:before="100" w:after="120" w:line="266" w:lineRule="auto"/>
       </w:pPr>
       <w:r>
         <w:rPr>
@@ -372,9 +372,9 @@
         <w:keepNext/>
         <w:keepLines/>
         <w:tabs>
-          <w:tab w:pos="10369" w:val="right"/>
+          <w:tab w:pos="10511" w:val="right"/>
         </w:tabs>
-        <w:spacing w:before="0" w:after="0" w:line="269" w:lineRule="auto"/>
+        <w:spacing w:before="0" w:after="0" w:line="266" w:lineRule="auto"/>
       </w:pPr>
       <w:r>
         <w:rPr>
@@ -401,7 +401,7 @@
       <w:pPr>
         <w:keepNext/>
         <w:keepLines/>
-        <w:spacing w:before="40" w:after="100" w:line="269" w:lineRule="auto"/>
+        <w:spacing w:before="40" w:after="100" w:line="266" w:lineRule="auto"/>
       </w:pPr>
       <w:r>
         <w:rPr>
@@ -418,7 +418,7 @@
       <w:pPr>
         <w:keepNext/>
         <w:keepLines/>
-        <w:spacing w:before="0" w:after="40" w:line="269" w:lineRule="auto"/>
+        <w:spacing w:before="0" w:after="34" w:line="266" w:lineRule="auto"/>
         <w:ind w:left="238" w:hanging="238"/>
         <w:jc w:val="both"/>
       </w:pPr>
@@ -464,7 +464,7 @@
       <w:pPr>
         <w:keepNext/>
         <w:keepLines/>
-        <w:spacing w:before="0" w:after="40" w:line="269" w:lineRule="auto"/>
+        <w:spacing w:before="0" w:after="34" w:line="266" w:lineRule="auto"/>
         <w:ind w:left="238" w:hanging="238"/>
         <w:jc w:val="both"/>
       </w:pPr>
@@ -510,7 +510,7 @@
       <w:pPr>
         <w:keepNext/>
         <w:keepLines/>
-        <w:spacing w:before="0" w:after="40" w:line="269" w:lineRule="auto"/>
+        <w:spacing w:before="0" w:after="34" w:line="266" w:lineRule="auto"/>
         <w:ind w:left="238" w:hanging="238"/>
         <w:jc w:val="both"/>
       </w:pPr>
@@ -556,7 +556,7 @@
       <w:pPr>
         <w:keepNext w:val="0"/>
         <w:keepLines/>
-        <w:spacing w:before="0" w:after="40" w:line="269" w:lineRule="auto"/>
+        <w:spacing w:before="0" w:after="34" w:line="266" w:lineRule="auto"/>
         <w:ind w:left="238" w:hanging="238"/>
         <w:jc w:val="both"/>
       </w:pPr>
@@ -595,9 +595,9 @@
         <w:keepNext/>
         <w:keepLines/>
         <w:tabs>
-          <w:tab w:pos="10369" w:val="right"/>
+          <w:tab w:pos="10511" w:val="right"/>
         </w:tabs>
-        <w:spacing w:before="140" w:after="0" w:line="269" w:lineRule="auto"/>
+        <w:spacing w:before="130" w:after="0" w:line="266" w:lineRule="auto"/>
       </w:pPr>
       <w:r>
         <w:rPr>
@@ -624,7 +624,7 @@
       <w:pPr>
         <w:keepNext/>
         <w:keepLines/>
-        <w:spacing w:before="40" w:after="100" w:line="269" w:lineRule="auto"/>
+        <w:spacing w:before="40" w:after="100" w:line="266" w:lineRule="auto"/>
       </w:pPr>
       <w:r>
         <w:rPr>
@@ -641,7 +641,7 @@
       <w:pPr>
         <w:keepNext/>
         <w:keepLines/>
-        <w:spacing w:before="0" w:after="40" w:line="269" w:lineRule="auto"/>
+        <w:spacing w:before="0" w:after="34" w:line="266" w:lineRule="auto"/>
         <w:ind w:left="238" w:hanging="238"/>
         <w:jc w:val="both"/>
       </w:pPr>
@@ -687,7 +687,7 @@
       <w:pPr>
         <w:keepNext/>
         <w:keepLines/>
-        <w:spacing w:before="0" w:after="40" w:line="269" w:lineRule="auto"/>
+        <w:spacing w:before="0" w:after="34" w:line="266" w:lineRule="auto"/>
         <w:ind w:left="238" w:hanging="238"/>
         <w:jc w:val="both"/>
       </w:pPr>
@@ -733,7 +733,7 @@
       <w:pPr>
         <w:keepNext/>
         <w:keepLines/>
-        <w:spacing w:before="0" w:after="40" w:line="269" w:lineRule="auto"/>
+        <w:spacing w:before="0" w:after="34" w:line="266" w:lineRule="auto"/>
         <w:ind w:left="238" w:hanging="238"/>
         <w:jc w:val="both"/>
       </w:pPr>
@@ -779,7 +779,7 @@
       <w:pPr>
         <w:keepNext/>
         <w:keepLines/>
-        <w:spacing w:before="0" w:after="40" w:line="269" w:lineRule="auto"/>
+        <w:spacing w:before="0" w:after="34" w:line="266" w:lineRule="auto"/>
         <w:ind w:left="238" w:hanging="238"/>
         <w:jc w:val="both"/>
       </w:pPr>
@@ -825,7 +825,7 @@
       <w:pPr>
         <w:keepNext/>
         <w:keepLines/>
-        <w:spacing w:before="0" w:after="40" w:line="269" w:lineRule="auto"/>
+        <w:spacing w:before="0" w:after="34" w:line="266" w:lineRule="auto"/>
         <w:ind w:left="238" w:hanging="238"/>
         <w:jc w:val="both"/>
       </w:pPr>
@@ -871,7 +871,7 @@
       <w:pPr>
         <w:keepNext w:val="0"/>
         <w:keepLines/>
-        <w:spacing w:before="0" w:after="40" w:line="269" w:lineRule="auto"/>
+        <w:spacing w:before="0" w:after="34" w:line="266" w:lineRule="auto"/>
         <w:ind w:left="238" w:hanging="238"/>
         <w:jc w:val="both"/>
       </w:pPr>
@@ -919,9 +919,9 @@
         <w:keepLines/>
         <w:pageBreakBefore/>
         <w:tabs>
-          <w:tab w:pos="10369" w:val="right"/>
+          <w:tab w:pos="10511" w:val="right"/>
         </w:tabs>
-        <w:spacing w:before="140" w:after="0" w:line="269" w:lineRule="auto"/>
+        <w:spacing w:before="130" w:after="0" w:line="266" w:lineRule="auto"/>
       </w:pPr>
       <w:r>
         <w:rPr>
@@ -948,7 +948,7 @@
       <w:pPr>
         <w:keepNext/>
         <w:keepLines/>
-        <w:spacing w:before="40" w:after="100" w:line="269" w:lineRule="auto"/>
+        <w:spacing w:before="40" w:after="100" w:line="266" w:lineRule="auto"/>
       </w:pPr>
       <w:r>
         <w:rPr>
@@ -965,7 +965,7 @@
       <w:pPr>
         <w:keepNext/>
         <w:keepLines/>
-        <w:spacing w:before="0" w:after="40" w:line="269" w:lineRule="auto"/>
+        <w:spacing w:before="0" w:after="34" w:line="266" w:lineRule="auto"/>
         <w:ind w:left="238" w:hanging="238"/>
         <w:jc w:val="both"/>
       </w:pPr>
@@ -1011,7 +1011,7 @@
       <w:pPr>
         <w:keepNext w:val="0"/>
         <w:keepLines/>
-        <w:spacing w:before="0" w:after="40" w:line="269" w:lineRule="auto"/>
+        <w:spacing w:before="0" w:after="34" w:line="266" w:lineRule="auto"/>
         <w:ind w:left="238" w:hanging="238"/>
         <w:jc w:val="both"/>
       </w:pPr>
@@ -1058,9 +1058,9 @@
         <w:keepNext/>
         <w:keepLines/>
         <w:tabs>
-          <w:tab w:pos="10369" w:val="right"/>
+          <w:tab w:pos="10511" w:val="right"/>
         </w:tabs>
-        <w:spacing w:before="140" w:after="0" w:line="269" w:lineRule="auto"/>
+        <w:spacing w:before="130" w:after="0" w:line="266" w:lineRule="auto"/>
       </w:pPr>
       <w:r>
         <w:rPr>
@@ -1087,7 +1087,7 @@
       <w:pPr>
         <w:keepNext/>
         <w:keepLines/>
-        <w:spacing w:before="40" w:after="100" w:line="269" w:lineRule="auto"/>
+        <w:spacing w:before="40" w:after="100" w:line="266" w:lineRule="auto"/>
       </w:pPr>
       <w:r>
         <w:rPr>
@@ -1104,7 +1104,7 @@
       <w:pPr>
         <w:keepNext/>
         <w:keepLines/>
-        <w:spacing w:before="0" w:after="40" w:line="269" w:lineRule="auto"/>
+        <w:spacing w:before="0" w:after="34" w:line="266" w:lineRule="auto"/>
         <w:ind w:left="238" w:hanging="238"/>
         <w:jc w:val="both"/>
       </w:pPr>
@@ -1142,7 +1142,7 @@
       <w:pPr>
         <w:keepNext/>
         <w:keepLines/>
-        <w:spacing w:before="0" w:after="40" w:line="269" w:lineRule="auto"/>
+        <w:spacing w:before="0" w:after="34" w:line="266" w:lineRule="auto"/>
         <w:ind w:left="238" w:hanging="238"/>
         <w:jc w:val="both"/>
       </w:pPr>
@@ -1188,7 +1188,7 @@
       <w:pPr>
         <w:keepNext/>
         <w:keepLines/>
-        <w:spacing w:before="0" w:after="40" w:line="269" w:lineRule="auto"/>
+        <w:spacing w:before="0" w:after="34" w:line="266" w:lineRule="auto"/>
         <w:ind w:left="238" w:hanging="238"/>
         <w:jc w:val="both"/>
       </w:pPr>
@@ -1234,7 +1234,7 @@
       <w:pPr>
         <w:keepNext w:val="0"/>
         <w:keepLines/>
-        <w:spacing w:before="0" w:after="40" w:line="269" w:lineRule="auto"/>
+        <w:spacing w:before="0" w:after="34" w:line="266" w:lineRule="auto"/>
         <w:ind w:left="238" w:hanging="238"/>
         <w:jc w:val="both"/>
       </w:pPr>
@@ -1278,8 +1278,8 @@
     </w:p>
     <w:p>
       <w:pPr>
-        <w:spacing w:before="150" w:after="0" w:line="240" w:lineRule="auto"/>
-        <w:ind w:right="9122"/>
+        <w:spacing w:before="130" w:after="0" w:line="240" w:lineRule="auto"/>
+        <w:ind w:right="9264"/>
         <w:pBdr>
           <w:top w:val="single" w:sz="18" w:space="0" w:color="0D0D0D"/>
         </w:pBdr>
@@ -1295,7 +1295,7 @@
     <w:p>
       <w:pPr>
         <w:keepNext/>
-        <w:spacing w:before="100" w:after="120" w:line="269" w:lineRule="auto"/>
+        <w:spacing w:before="100" w:after="120" w:line="266" w:lineRule="auto"/>
       </w:pPr>
       <w:r>
         <w:rPr>
@@ -1313,9 +1313,9 @@
         <w:keepNext/>
         <w:keepLines/>
         <w:tabs>
-          <w:tab w:pos="10369" w:val="right"/>
+          <w:tab w:pos="10511" w:val="right"/>
         </w:tabs>
-        <w:spacing w:before="0" w:after="0" w:line="269" w:lineRule="auto"/>
+        <w:spacing w:before="0" w:after="0" w:line="266" w:lineRule="auto"/>
       </w:pPr>
       <w:r>
         <w:rPr>
@@ -1342,7 +1342,7 @@
       <w:pPr>
         <w:keepNext w:val="0"/>
         <w:keepLines/>
-        <w:spacing w:before="30" w:after="0" w:line="269" w:lineRule="auto"/>
+        <w:spacing w:before="30" w:after="0" w:line="266" w:lineRule="auto"/>
       </w:pPr>
       <w:r>
         <w:rPr>
@@ -1359,9 +1359,9 @@
         <w:keepNext/>
         <w:keepLines/>
         <w:tabs>
-          <w:tab w:pos="10369" w:val="right"/>
+          <w:tab w:pos="10511" w:val="right"/>
         </w:tabs>
-        <w:spacing w:before="160" w:after="0" w:line="269" w:lineRule="auto"/>
+        <w:spacing w:before="160" w:after="0" w:line="266" w:lineRule="auto"/>
       </w:pPr>
       <w:r>
         <w:rPr>
@@ -1388,7 +1388,7 @@
       <w:pPr>
         <w:keepNext w:val="0"/>
         <w:keepLines/>
-        <w:spacing w:before="30" w:after="0" w:line="269" w:lineRule="auto"/>
+        <w:spacing w:before="30" w:after="0" w:line="266" w:lineRule="auto"/>
       </w:pPr>
       <w:r>
         <w:rPr>
@@ -1405,9 +1405,9 @@
         <w:keepNext/>
         <w:keepLines/>
         <w:tabs>
-          <w:tab w:pos="10369" w:val="right"/>
+          <w:tab w:pos="10511" w:val="right"/>
         </w:tabs>
-        <w:spacing w:before="160" w:after="0" w:line="269" w:lineRule="auto"/>
+        <w:spacing w:before="160" w:after="0" w:line="266" w:lineRule="auto"/>
       </w:pPr>
       <w:r>
         <w:rPr>
@@ -1434,7 +1434,7 @@
       <w:pPr>
         <w:keepNext w:val="0"/>
         <w:keepLines/>
-        <w:spacing w:before="30" w:after="0" w:line="269" w:lineRule="auto"/>
+        <w:spacing w:before="30" w:after="0" w:line="266" w:lineRule="auto"/>
       </w:pPr>
       <w:r>
         <w:rPr>
@@ -1448,8 +1448,8 @@
     </w:p>
     <w:p>
       <w:pPr>
-        <w:spacing w:before="150" w:after="0" w:line="240" w:lineRule="auto"/>
-        <w:ind w:right="9122"/>
+        <w:spacing w:before="130" w:after="0" w:line="240" w:lineRule="auto"/>
+        <w:ind w:right="9264"/>
         <w:pBdr>
           <w:top w:val="single" w:sz="18" w:space="0" w:color="0D0D0D"/>
         </w:pBdr>
@@ -1465,7 +1465,7 @@
     <w:p>
       <w:pPr>
         <w:keepNext/>
-        <w:spacing w:before="100" w:after="120" w:line="269" w:lineRule="auto"/>
+        <w:spacing w:before="100" w:after="120" w:line="266" w:lineRule="auto"/>
       </w:pPr>
       <w:r>
         <w:rPr>
@@ -1480,7 +1480,7 @@
     </w:p>
     <w:p>
       <w:pPr>
-        <w:spacing w:before="0" w:after="40" w:line="269" w:lineRule="auto"/>
+        <w:spacing w:before="0" w:after="34" w:line="266" w:lineRule="auto"/>
         <w:ind w:left="238" w:hanging="238"/>
         <w:jc w:val="both"/>
       </w:pPr>
@@ -1516,7 +1516,7 @@
     </w:p>
     <w:p>
       <w:pPr>
-        <w:spacing w:before="0" w:after="40" w:line="269" w:lineRule="auto"/>
+        <w:spacing w:before="0" w:after="34" w:line="266" w:lineRule="auto"/>
         <w:ind w:left="238" w:hanging="238"/>
         <w:jc w:val="both"/>
       </w:pPr>
@@ -1552,7 +1552,7 @@
     </w:p>
     <w:p>
       <w:pPr>
-        <w:spacing w:before="0" w:after="40" w:line="269" w:lineRule="auto"/>
+        <w:spacing w:before="0" w:after="34" w:line="266" w:lineRule="auto"/>
         <w:ind w:left="238" w:hanging="238"/>
         <w:jc w:val="both"/>
       </w:pPr>
@@ -1588,8 +1588,8 @@
     </w:p>
     <w:p>
       <w:pPr>
-        <w:spacing w:before="150" w:after="0" w:line="240" w:lineRule="auto"/>
-        <w:ind w:right="9122"/>
+        <w:spacing w:before="130" w:after="0" w:line="240" w:lineRule="auto"/>
+        <w:ind w:right="9264"/>
         <w:pBdr>
           <w:top w:val="single" w:sz="18" w:space="0" w:color="0D0D0D"/>
         </w:pBdr>
@@ -1605,7 +1605,7 @@
     <w:p>
       <w:pPr>
         <w:keepNext/>
-        <w:spacing w:before="100" w:after="120" w:line="269" w:lineRule="auto"/>
+        <w:spacing w:before="100" w:after="120" w:line="266" w:lineRule="auto"/>
       </w:pPr>
       <w:r>
         <w:rPr>
@@ -1620,7 +1620,7 @@
     </w:p>
     <w:p>
       <w:pPr>
-        <w:spacing w:before="0" w:after="0" w:line="307" w:lineRule="auto"/>
+        <w:spacing w:before="0" w:after="0" w:line="305" w:lineRule="auto"/>
         <w:suppressAutoHyphens w:val="1"/>
       </w:pPr>
       <w:r>
@@ -1736,8 +1736,8 @@
     </w:p>
     <w:p>
       <w:pPr>
-        <w:spacing w:before="150" w:after="0" w:line="240" w:lineRule="auto"/>
-        <w:ind w:right="9122"/>
+        <w:spacing w:before="130" w:after="0" w:line="240" w:lineRule="auto"/>
+        <w:ind w:right="9264"/>
         <w:pBdr>
           <w:top w:val="single" w:sz="18" w:space="0" w:color="0D0D0D"/>
         </w:pBdr>
@@ -1753,7 +1753,7 @@
     <w:p>
       <w:pPr>
         <w:keepNext/>
-        <w:spacing w:before="100" w:after="120" w:line="269" w:lineRule="auto"/>
+        <w:spacing w:before="100" w:after="120" w:line="266" w:lineRule="auto"/>
       </w:pPr>
       <w:r>
         <w:rPr>
@@ -1768,7 +1768,7 @@
     </w:p>
     <w:p>
       <w:pPr>
-        <w:spacing w:before="0" w:after="40" w:line="269" w:lineRule="auto"/>
+        <w:spacing w:before="0" w:after="34" w:line="266" w:lineRule="auto"/>
         <w:ind w:left="238" w:hanging="238"/>
         <w:jc w:val="both"/>
       </w:pPr>
@@ -1804,7 +1804,7 @@
     </w:p>
     <w:p>
       <w:pPr>
-        <w:spacing w:before="0" w:after="40" w:line="269" w:lineRule="auto"/>
+        <w:spacing w:before="0" w:after="34" w:line="266" w:lineRule="auto"/>
         <w:ind w:left="238" w:hanging="238"/>
         <w:jc w:val="both"/>
       </w:pPr>
@@ -1840,7 +1840,7 @@
     </w:p>
     <w:sectPr>
       <w:pgSz w:w="12240" w:h="15840"/>
-      <w:pgMar w:top="567" w:right="879" w:bottom="454" w:left="992" w:header="720" w:footer="720" w:gutter="0"/>
+      <w:pgMar w:top="539" w:right="822" w:bottom="425" w:left="907" w:header="720" w:footer="720" w:gutter="0"/>
       <w:cols w:space="720"/>
       <w:docGrid w:linePitch="360"/>
     </w:sectPr>
@@ -2212,7 +2212,7 @@
     <w:qFormat/>
     <w:rsid w:val="00FC693F"/>
     <w:pPr>
-      <w:spacing w:before="0" w:after="0" w:line="269" w:lineRule="auto"/>
+      <w:spacing w:before="0" w:after="0" w:line="266" w:lineRule="auto"/>
     </w:pPr>
     <w:rPr>
       <w:rFonts w:ascii="Calibri" w:hAnsi="Calibri" w:eastAsia="Calibri"/>

</xml_diff>

<commit_message>
Perfil profesional mas breve, sin perder cobertura del aviso
Baja de 166 a 136 palabras (-18%) manteniendo los diez requisitos del
aviso 6110632 que el perfil debe cubrir. Incorpora "acompanamiento
social" del texto propuesto por la postulante.

Se descarto reemplazarlo por el perfil del CV original: cubria 4 de 10
requisitos y omitia los dos diferenciadores del cargo (creacion del
departamento desde cero y Seguro Complementario de Salud), ademas de
declarar 7 anios cuando las fechas suman 9,3 y dar por terminado un
diplomado que esta en curso.

Repaginado de los cuatro documentos y de la web:
- Editorial 3,01 | Minimal 2,86 | Banda 2,62 | Sidebar 3,31 cm libres.
- La version editorial recupera aire, que habia quedado con 4,21 cm.
- El afinador del HTML ahora acepta un rango de llenado en vez de un
  valor exacto, para no oscilar entre dos saltos de linea.

Co-Authored-By: Claude Opus 5 <noreply@anthropic.com>
Claude-Session: https://claude.ai/code/session_01FQzQFNEQJbZhUnuA1Gqnqx
</commit_message>
<xml_diff>
--- a/cv-trabajador-social-uc/CV_Jeniffer_Mieres_01_Minimal.docx
+++ b/cv-trabajador-social-uc/CV_Jeniffer_Mieres_01_Minimal.docx
@@ -105,7 +105,7 @@
           <w:b w:val="0"/>
           <w:sz w:val="18"/>
         </w:rPr>
-        <w:t>Trabajadora Social titulada con distinción y más de 9 años de experiencia en bienestar laboral, gestión de beneficios y atención social directa, desarrollada en instituciones de educación superior y en empresa privada.</w:t>
+        <w:t>Trabajadora Social titulada con distinción y más de 9 años de experiencia en bienestar laboral, gestión de beneficios, evaluación socioeconómica y acompañamiento social.</w:t>
       </w:r>
     </w:p>
     <w:p>
@@ -119,7 +119,7 @@
           <w:b w:val="0"/>
           <w:sz w:val="18"/>
         </w:rPr>
-        <w:t>Creé desde cero el Departamento de Bienestar Social de una organización con más de 200 colaboradores, administrando el Seguro Complementario de Salud, las licencias médicas y las cargas familiares de la dotación. Luego lideré la gestión de personas y bienestar en la consultora minera Bmining, a cargo de los programas de bienestar, convenios, plan anual de capacitación, clima laboral y de la matriz de riesgo y salud en el trabajo con seguimiento por KPI.</w:t>
+        <w:t>Creé desde cero el Departamento de Bienestar Social de una organización con más de 200 colaboradores, administrando el Seguro Complementario de Salud, las licencias médicas y las cargas familiares. Luego lideré la gestión de personas y bienestar en la consultora minera Bmining, a cargo de programas, convenios, capacitación y clima laboral, y de la matriz de riesgo y salud en el trabajo con seguimiento por KPI.</w:t>
       </w:r>
     </w:p>
     <w:p>
@@ -133,7 +133,7 @@
           <w:b w:val="0"/>
           <w:sz w:val="18"/>
         </w:rPr>
-        <w:t>Hoy me desempeño en la Universidad de Santiago de Chile, donde realizo evaluaciones socioeconómicas en los sistemas del Ministerio de Educación, gestiono beneficios ministeriales e internos y acompaño casos que requieren articular áreas internas con redes de apoyo. A la atención directa sumo una mirada de proceso: fui auditora interna del Sistema de Gestión Integrado (ISO 9001, 14001 y 45001).</w:t>
+        <w:t>Hoy, en la Universidad de Santiago de Chile, realizo evaluaciones socioeconómicas, gestiono beneficios ministeriales e internos y acompaño casos que requieren articular áreas internas con redes de apoyo. Sumo además una mirada de proceso: fui auditora interna del Sistema de Gestión Integrado (ISO 9001, 14001 y 45001).</w:t>
       </w:r>
     </w:p>
     <w:p>

</xml_diff>

<commit_message>
Restaura las negritas interiores de las vinietas
La postulante pidio volver atras: las frases clave dentro de cada
vinieta recuperan su negrita original en las seis variantes. La
reconstruccion separa cada texto fusionado en (previo, clave, resto)
con la lista exacta de frases clave por cargo, validando que cada una
aparezca una sola vez en su vinieta.

Paginacion re-verificada: seis variantes en 2 paginas, mismos presets
y holguras.

Co-Authored-By: Claude Fable 5 <noreply@anthropic.com>
Claude-Session: https://claude.ai/code/session_01FQzQFNEQJbZhUnuA1Gqnqx
</commit_message>
<xml_diff>
--- a/cv-trabajador-social-uc/CV_Jeniffer_Mieres_01_Minimal.docx
+++ b/cv-trabajador-social-uc/CV_Jeniffer_Mieres_01_Minimal.docx
@@ -478,7 +478,26 @@
           <w:i w:val="0"/>
           <w:sz w:val="19"/>
         </w:rPr>
-        <w:t>Realizo la evaluación socioeconómica de cada caso, revisando antecedentes y acreditaciones en los sistemas del Ministerio de Educación para definir con autonomía qué apoyo corresponde.</w:t>
+        <w:t xml:space="preserve">Realizo la </w:t>
+      </w:r>
+      <w:r>
+        <w:rPr>
+          <w:rFonts w:ascii="Calibri" w:hAnsi="Calibri" w:eastAsia="Calibri" w:cs="Calibri"/>
+          <w:b/>
+          <w:i w:val="0"/>
+          <w:color w:val="0D0D0D"/>
+          <w:sz w:val="19"/>
+        </w:rPr>
+        <w:t>evaluación socioeconómica</w:t>
+      </w:r>
+      <w:r>
+        <w:rPr>
+          <w:rFonts w:ascii="Calibri" w:hAnsi="Calibri" w:eastAsia="Calibri" w:cs="Calibri"/>
+          <w:b w:val="0"/>
+          <w:i w:val="0"/>
+          <w:sz w:val="19"/>
+        </w:rPr>
+        <w:t xml:space="preserve"> de cada caso, revisando antecedentes y acreditaciones en los sistemas del Ministerio de Educación para definir con autonomía qué apoyo corresponde.</w:t>
       </w:r>
     </w:p>
     <w:p>
@@ -509,7 +528,26 @@
           <w:i w:val="0"/>
           <w:sz w:val="19"/>
         </w:rPr>
-        <w:t>Gestiono beneficios ministeriales e internos de principio a fin: verificación de requisitos, preselección, seguimiento y registro documental. Elaboro informes sociales y mantengo la trazabilidad de la cartera de casos a mi cargo.</w:t>
+        <w:t xml:space="preserve">Gestiono </w:t>
+      </w:r>
+      <w:r>
+        <w:rPr>
+          <w:rFonts w:ascii="Calibri" w:hAnsi="Calibri" w:eastAsia="Calibri" w:cs="Calibri"/>
+          <w:b/>
+          <w:i w:val="0"/>
+          <w:color w:val="0D0D0D"/>
+          <w:sz w:val="19"/>
+        </w:rPr>
+        <w:t>beneficios ministeriales e internos</w:t>
+      </w:r>
+      <w:r>
+        <w:rPr>
+          <w:rFonts w:ascii="Calibri" w:hAnsi="Calibri" w:eastAsia="Calibri" w:cs="Calibri"/>
+          <w:b w:val="0"/>
+          <w:i w:val="0"/>
+          <w:sz w:val="19"/>
+        </w:rPr>
+        <w:t xml:space="preserve"> de principio a fin: verificación de requisitos, preselección, seguimiento y registro documental. Elaboro informes sociales y mantengo la trazabilidad de la cartera de casos a mi cargo.</w:t>
       </w:r>
     </w:p>
     <w:p>
@@ -540,7 +578,26 @@
           <w:i w:val="0"/>
           <w:sz w:val="19"/>
         </w:rPr>
-        <w:t>Atiendo al estudiantado de manera permanente y entrego orientación social personalizada, acompañándolo durante todo el proceso de postulación.</w:t>
+        <w:t xml:space="preserve">Atiendo al estudiantado de manera permanente y entrego </w:t>
+      </w:r>
+      <w:r>
+        <w:rPr>
+          <w:rFonts w:ascii="Calibri" w:hAnsi="Calibri" w:eastAsia="Calibri" w:cs="Calibri"/>
+          <w:b/>
+          <w:i w:val="0"/>
+          <w:color w:val="0D0D0D"/>
+          <w:sz w:val="19"/>
+        </w:rPr>
+        <w:t>orientación social personalizada</w:t>
+      </w:r>
+      <w:r>
+        <w:rPr>
+          <w:rFonts w:ascii="Calibri" w:hAnsi="Calibri" w:eastAsia="Calibri" w:cs="Calibri"/>
+          <w:b w:val="0"/>
+          <w:i w:val="0"/>
+          <w:sz w:val="19"/>
+        </w:rPr>
+        <w:t>, acompañándolo durante todo el proceso de postulación.</w:t>
       </w:r>
     </w:p>
     <w:p>
@@ -567,11 +624,21 @@
       <w:r>
         <w:rPr>
           <w:rFonts w:ascii="Calibri" w:hAnsi="Calibri" w:eastAsia="Calibri" w:cs="Calibri"/>
+          <w:b/>
+          <w:i w:val="0"/>
+          <w:color w:val="0D0D0D"/>
+          <w:sz w:val="19"/>
+        </w:rPr>
+        <w:t>Coordino casos complejos</w:t>
+      </w:r>
+      <w:r>
+        <w:rPr>
+          <w:rFonts w:ascii="Calibri" w:hAnsi="Calibri" w:eastAsia="Calibri" w:cs="Calibri"/>
           <w:b w:val="0"/>
           <w:i w:val="0"/>
           <w:sz w:val="19"/>
         </w:rPr>
-        <w:t>Coordino casos complejos con áreas internas de la universidad y con redes de apoyo externas cuando la necesidad excede el ámbito académico.</w:t>
+        <w:t xml:space="preserve"> con áreas internas de la universidad y con redes de apoyo externas cuando la necesidad excede el ámbito académico.</w:t>
       </w:r>
     </w:p>
     <w:p>
@@ -653,7 +720,26 @@
           <w:i w:val="0"/>
           <w:sz w:val="19"/>
         </w:rPr>
-        <w:t>Estuve a cargo de los programas de bienestar y beneficios de los colaboradores, desde la definición de la oferta hasta su implementación y seguimiento, con foco en el clima laboral y en el día a día de la empresa.</w:t>
+        <w:t xml:space="preserve">Estuve a cargo de los </w:t>
+      </w:r>
+      <w:r>
+        <w:rPr>
+          <w:rFonts w:ascii="Calibri" w:hAnsi="Calibri" w:eastAsia="Calibri" w:cs="Calibri"/>
+          <w:b/>
+          <w:i w:val="0"/>
+          <w:color w:val="0D0D0D"/>
+          <w:sz w:val="19"/>
+        </w:rPr>
+        <w:t>programas de bienestar y beneficios</w:t>
+      </w:r>
+      <w:r>
+        <w:rPr>
+          <w:rFonts w:ascii="Calibri" w:hAnsi="Calibri" w:eastAsia="Calibri" w:cs="Calibri"/>
+          <w:b w:val="0"/>
+          <w:i w:val="0"/>
+          <w:sz w:val="19"/>
+        </w:rPr>
+        <w:t xml:space="preserve"> de los colaboradores, desde la definición de la oferta hasta su implementación y seguimiento, con foco en el clima laboral y en el día a día de la empresa.</w:t>
       </w:r>
     </w:p>
     <w:p>
@@ -684,7 +770,26 @@
           <w:i w:val="0"/>
           <w:sz w:val="19"/>
         </w:rPr>
-        <w:t>Gestioné convenios y beneficios orientados a la calidad de vida laboral, administrando la relación con instituciones y proveedores externos.</w:t>
+        <w:t xml:space="preserve">Gestioné </w:t>
+      </w:r>
+      <w:r>
+        <w:rPr>
+          <w:rFonts w:ascii="Calibri" w:hAnsi="Calibri" w:eastAsia="Calibri" w:cs="Calibri"/>
+          <w:b/>
+          <w:i w:val="0"/>
+          <w:color w:val="0D0D0D"/>
+          <w:sz w:val="19"/>
+        </w:rPr>
+        <w:t>convenios y beneficios orientados a la calidad de vida laboral</w:t>
+      </w:r>
+      <w:r>
+        <w:rPr>
+          <w:rFonts w:ascii="Calibri" w:hAnsi="Calibri" w:eastAsia="Calibri" w:cs="Calibri"/>
+          <w:b w:val="0"/>
+          <w:i w:val="0"/>
+          <w:sz w:val="19"/>
+        </w:rPr>
+        <w:t>, administrando la relación con instituciones y proveedores externos.</w:t>
       </w:r>
     </w:p>
     <w:p>
@@ -715,7 +820,26 @@
           <w:i w:val="0"/>
           <w:sz w:val="19"/>
         </w:rPr>
-        <w:t>Organicé actividades corporativas de bienestar e integración, articulando a las distintas áreas para asegurar convocatoria y buena ejecución.</w:t>
+        <w:t xml:space="preserve">Organicé </w:t>
+      </w:r>
+      <w:r>
+        <w:rPr>
+          <w:rFonts w:ascii="Calibri" w:hAnsi="Calibri" w:eastAsia="Calibri" w:cs="Calibri"/>
+          <w:b/>
+          <w:i w:val="0"/>
+          <w:color w:val="0D0D0D"/>
+          <w:sz w:val="19"/>
+        </w:rPr>
+        <w:t>actividades corporativas de bienestar e integración</w:t>
+      </w:r>
+      <w:r>
+        <w:rPr>
+          <w:rFonts w:ascii="Calibri" w:hAnsi="Calibri" w:eastAsia="Calibri" w:cs="Calibri"/>
+          <w:b w:val="0"/>
+          <w:i w:val="0"/>
+          <w:sz w:val="19"/>
+        </w:rPr>
+        <w:t>, articulando a las distintas áreas para asegurar convocatoria y buena ejecución.</w:t>
       </w:r>
     </w:p>
     <w:p>
@@ -746,7 +870,26 @@
           <w:i w:val="0"/>
           <w:sz w:val="19"/>
         </w:rPr>
-        <w:t>Tuve a cargo la matriz de riesgo y salud en el trabajo junto al prevencionista externo, con seguimiento por KPI para dar cumplimiento a la certificación.</w:t>
+        <w:t xml:space="preserve">Tuve a cargo la </w:t>
+      </w:r>
+      <w:r>
+        <w:rPr>
+          <w:rFonts w:ascii="Calibri" w:hAnsi="Calibri" w:eastAsia="Calibri" w:cs="Calibri"/>
+          <w:b/>
+          <w:i w:val="0"/>
+          <w:color w:val="0D0D0D"/>
+          <w:sz w:val="19"/>
+        </w:rPr>
+        <w:t>matriz de riesgo y salud en el trabajo</w:t>
+      </w:r>
+      <w:r>
+        <w:rPr>
+          <w:rFonts w:ascii="Calibri" w:hAnsi="Calibri" w:eastAsia="Calibri" w:cs="Calibri"/>
+          <w:b w:val="0"/>
+          <w:i w:val="0"/>
+          <w:sz w:val="19"/>
+        </w:rPr>
+        <w:t xml:space="preserve"> junto al prevencionista externo, con seguimiento por KPI para dar cumplimiento a la certificación.</w:t>
       </w:r>
     </w:p>
     <w:p>
@@ -777,7 +920,26 @@
           <w:i w:val="0"/>
           <w:sz w:val="19"/>
         </w:rPr>
-        <w:t>Lideré el plan anual de capacitaciones internas de la compañía.</w:t>
+        <w:t xml:space="preserve">Lideré el </w:t>
+      </w:r>
+      <w:r>
+        <w:rPr>
+          <w:rFonts w:ascii="Calibri" w:hAnsi="Calibri" w:eastAsia="Calibri" w:cs="Calibri"/>
+          <w:b/>
+          <w:i w:val="0"/>
+          <w:color w:val="0D0D0D"/>
+          <w:sz w:val="19"/>
+        </w:rPr>
+        <w:t>plan anual de capacitaciones internas</w:t>
+      </w:r>
+      <w:r>
+        <w:rPr>
+          <w:rFonts w:ascii="Calibri" w:hAnsi="Calibri" w:eastAsia="Calibri" w:cs="Calibri"/>
+          <w:b w:val="0"/>
+          <w:i w:val="0"/>
+          <w:sz w:val="19"/>
+        </w:rPr>
+        <w:t xml:space="preserve"> de la compañía.</w:t>
       </w:r>
     </w:p>
     <w:p>
@@ -808,7 +970,26 @@
           <w:i w:val="0"/>
           <w:sz w:val="19"/>
         </w:rPr>
-        <w:t>Asumí durante un año el Sistema de Gestión Integrado como auditora interna en las certificaciones ISO 9001:2015, ISO 14001:2015 e ISO 45001:2018 (Seguridad y Salud en el Trabajo).</w:t>
+        <w:t xml:space="preserve">Asumí durante un año el </w:t>
+      </w:r>
+      <w:r>
+        <w:rPr>
+          <w:rFonts w:ascii="Calibri" w:hAnsi="Calibri" w:eastAsia="Calibri" w:cs="Calibri"/>
+          <w:b/>
+          <w:i w:val="0"/>
+          <w:color w:val="0D0D0D"/>
+          <w:sz w:val="19"/>
+        </w:rPr>
+        <w:t>Sistema de Gestión Integrado como auditora interna</w:t>
+      </w:r>
+      <w:r>
+        <w:rPr>
+          <w:rFonts w:ascii="Calibri" w:hAnsi="Calibri" w:eastAsia="Calibri" w:cs="Calibri"/>
+          <w:b w:val="0"/>
+          <w:i w:val="0"/>
+          <w:sz w:val="19"/>
+        </w:rPr>
+        <w:t xml:space="preserve"> en las certificaciones ISO 9001:2015, ISO 14001:2015 e ISO 45001:2018 (Seguridad y Salud en el Trabajo).</w:t>
       </w:r>
     </w:p>
     <w:p>
@@ -891,7 +1072,26 @@
           <w:i w:val="0"/>
           <w:sz w:val="19"/>
         </w:rPr>
-        <w:t>Diseñé y dicté capacitaciones para emprendedores, con metodologías prácticas y grupales, y acompañé la gestión de sus proyectos revisando con cada participante qué reforzar.</w:t>
+        <w:t xml:space="preserve">Diseñé y dicté </w:t>
+      </w:r>
+      <w:r>
+        <w:rPr>
+          <w:rFonts w:ascii="Calibri" w:hAnsi="Calibri" w:eastAsia="Calibri" w:cs="Calibri"/>
+          <w:b/>
+          <w:i w:val="0"/>
+          <w:color w:val="0D0D0D"/>
+          <w:sz w:val="19"/>
+        </w:rPr>
+        <w:t>capacitaciones</w:t>
+      </w:r>
+      <w:r>
+        <w:rPr>
+          <w:rFonts w:ascii="Calibri" w:hAnsi="Calibri" w:eastAsia="Calibri" w:cs="Calibri"/>
+          <w:b w:val="0"/>
+          <w:i w:val="0"/>
+          <w:sz w:val="19"/>
+        </w:rPr>
+        <w:t xml:space="preserve"> para emprendedores, con metodologías prácticas y grupales, y acompañé la gestión de sus proyectos revisando con cada participante qué reforzar.</w:t>
       </w:r>
     </w:p>
     <w:p>
@@ -922,7 +1122,26 @@
           <w:i w:val="0"/>
           <w:sz w:val="19"/>
         </w:rPr>
-        <w:t>Orienté a los emprendedores en materia de vivienda, articulando con las redes de la comuna, y los vinculé con recursos disponibles que muchas veces no sabían que tenían a su alcance.</w:t>
+        <w:t xml:space="preserve">Orienté a los emprendedores en materia de </w:t>
+      </w:r>
+      <w:r>
+        <w:rPr>
+          <w:rFonts w:ascii="Calibri" w:hAnsi="Calibri" w:eastAsia="Calibri" w:cs="Calibri"/>
+          <w:b/>
+          <w:i w:val="0"/>
+          <w:color w:val="0D0D0D"/>
+          <w:sz w:val="19"/>
+        </w:rPr>
+        <w:t>vivienda</w:t>
+      </w:r>
+      <w:r>
+        <w:rPr>
+          <w:rFonts w:ascii="Calibri" w:hAnsi="Calibri" w:eastAsia="Calibri" w:cs="Calibri"/>
+          <w:b w:val="0"/>
+          <w:i w:val="0"/>
+          <w:sz w:val="19"/>
+        </w:rPr>
+        <w:t>, articulando con las redes de la comuna, y los vinculé con recursos disponibles que muchas veces no sabían que tenían a su alcance.</w:t>
       </w:r>
     </w:p>
     <w:p>
@@ -1000,11 +1219,21 @@
       <w:r>
         <w:rPr>
           <w:rFonts w:ascii="Calibri" w:hAnsi="Calibri" w:eastAsia="Calibri" w:cs="Calibri"/>
+          <w:b/>
+          <w:i w:val="0"/>
+          <w:color w:val="0D0D0D"/>
+          <w:sz w:val="19"/>
+        </w:rPr>
+        <w:t>Diseñé e implementé el departamento desde su origen</w:t>
+      </w:r>
+      <w:r>
+        <w:rPr>
+          <w:rFonts w:ascii="Calibri" w:hAnsi="Calibri" w:eastAsia="Calibri" w:cs="Calibri"/>
           <w:b w:val="0"/>
           <w:i w:val="0"/>
           <w:sz w:val="19"/>
         </w:rPr>
-        <w:t>Diseñé e implementé el departamento desde su origen, para una dotación de más de 200 colaboradores, definiendo la planificación de actividades y beneficios.</w:t>
+        <w:t>, para una dotación de más de 200 colaboradores, definiendo la planificación de actividades y beneficios.</w:t>
       </w:r>
     </w:p>
     <w:p>
@@ -1035,7 +1264,26 @@
           <w:i w:val="0"/>
           <w:sz w:val="19"/>
         </w:rPr>
-        <w:t>Administré el Seguro Complementario de Salud de la dotación, apoyando a los trabajadores en el acceso, uso y tramitación de reembolsos.</w:t>
+        <w:t xml:space="preserve">Administré el </w:t>
+      </w:r>
+      <w:r>
+        <w:rPr>
+          <w:rFonts w:ascii="Calibri" w:hAnsi="Calibri" w:eastAsia="Calibri" w:cs="Calibri"/>
+          <w:b/>
+          <w:i w:val="0"/>
+          <w:color w:val="0D0D0D"/>
+          <w:sz w:val="19"/>
+        </w:rPr>
+        <w:t>Seguro Complementario de Salud</w:t>
+      </w:r>
+      <w:r>
+        <w:rPr>
+          <w:rFonts w:ascii="Calibri" w:hAnsi="Calibri" w:eastAsia="Calibri" w:cs="Calibri"/>
+          <w:b w:val="0"/>
+          <w:i w:val="0"/>
+          <w:sz w:val="19"/>
+        </w:rPr>
+        <w:t xml:space="preserve"> de la dotación, apoyando a los trabajadores en el acceso, uso y tramitación de reembolsos.</w:t>
       </w:r>
     </w:p>
     <w:p>
@@ -1066,7 +1314,26 @@
           <w:i w:val="0"/>
           <w:sz w:val="19"/>
         </w:rPr>
-        <w:t>Gestioné licencias médicas ante la Caja de Compensación Los Andes y la incorporación de cargas familiares de los trabajadores.</w:t>
+        <w:t xml:space="preserve">Gestioné </w:t>
+      </w:r>
+      <w:r>
+        <w:rPr>
+          <w:rFonts w:ascii="Calibri" w:hAnsi="Calibri" w:eastAsia="Calibri" w:cs="Calibri"/>
+          <w:b/>
+          <w:i w:val="0"/>
+          <w:color w:val="0D0D0D"/>
+          <w:sz w:val="19"/>
+        </w:rPr>
+        <w:t>licencias médicas ante la Caja de Compensación Los Andes</w:t>
+      </w:r>
+      <w:r>
+        <w:rPr>
+          <w:rFonts w:ascii="Calibri" w:hAnsi="Calibri" w:eastAsia="Calibri" w:cs="Calibri"/>
+          <w:b w:val="0"/>
+          <w:i w:val="0"/>
+          <w:sz w:val="19"/>
+        </w:rPr>
+        <w:t xml:space="preserve"> y la incorporación de cargas familiares de los trabajadores.</w:t>
       </w:r>
     </w:p>
     <w:p>
@@ -1097,7 +1364,26 @@
           <w:i w:val="0"/>
           <w:sz w:val="19"/>
         </w:rPr>
-        <w:t>Realicé visitas semanales a la segunda sucursal, atendiendo en terreno las necesidades de beneficios internos y externos, principalmente en vivienda y salud.</w:t>
+        <w:t xml:space="preserve">Realicé </w:t>
+      </w:r>
+      <w:r>
+        <w:rPr>
+          <w:rFonts w:ascii="Calibri" w:hAnsi="Calibri" w:eastAsia="Calibri" w:cs="Calibri"/>
+          <w:b/>
+          <w:i w:val="0"/>
+          <w:color w:val="0D0D0D"/>
+          <w:sz w:val="19"/>
+        </w:rPr>
+        <w:t>visitas semanales a la segunda sucursal</w:t>
+      </w:r>
+      <w:r>
+        <w:rPr>
+          <w:rFonts w:ascii="Calibri" w:hAnsi="Calibri" w:eastAsia="Calibri" w:cs="Calibri"/>
+          <w:b w:val="0"/>
+          <w:i w:val="0"/>
+          <w:sz w:val="19"/>
+        </w:rPr>
+        <w:t>, atendiendo en terreno las necesidades de beneficios internos y externos, principalmente en vivienda y salud.</w:t>
       </w:r>
     </w:p>
     <w:p>

</xml_diff>

<commit_message>
Cuatro botones directos de descarga y generador de PDF en el navegador
- Word y PDF, del original y de la version editada, en cuatro botones
  que descargan al instante: ninguno pasa por el dialogo de impresion.
- pdfgen.js: generador de PDF que mide la maqueta real e incrusta
  Carlito y Caladea (subconjunto WinAnsi, mkpdffonts.py). Texto
  seleccionable apto para ATS; 2 paginas A4 en las seis propuestas.
- Corregido el fondo de las franjas de seccion al imprimir: eran campos
  .ed y la regla de impresion les borraba el fondo.
- zipPack() comprime los .docx generados en el navegador (40 KB).
- Las plantillas Word pasan de Carta a A4 para coincidir con la vista
  previa y el PDF. Holgura de pagina 1: de 2,5-3,4 cm a 4,2-5,1 cm.

Co-Authored-By: Claude Opus 5 <noreply@anthropic.com>
Claude-Session: https://claude.ai/code/session_01FQzQFNEQJbZhUnuA1Gqnqx
</commit_message>
<xml_diff>
--- a/cv-trabajador-social-uc/CV_Jeniffer_Mieres_01_Minimal.docx
+++ b/cv-trabajador-social-uc/CV_Jeniffer_Mieres_01_Minimal.docx
@@ -37,7 +37,7 @@
     <w:p>
       <w:pPr>
         <w:tabs>
-          <w:tab w:pos="10511" w:val="right"/>
+          <w:tab w:pos="10177" w:val="right"/>
         </w:tabs>
         <w:spacing w:before="0" w:after="0" w:line="266" w:lineRule="auto"/>
         <w:pBdr>
@@ -69,7 +69,7 @@
     <w:p>
       <w:pPr>
         <w:spacing w:before="120" w:after="0" w:line="240" w:lineRule="auto"/>
-        <w:ind w:right="9264"/>
+        <w:ind w:right="8930"/>
         <w:pBdr>
           <w:top w:val="single" w:sz="18" w:space="0" w:color="0D0D0D"/>
         </w:pBdr>
@@ -148,7 +148,7 @@
     <w:p>
       <w:pPr>
         <w:spacing w:before="130" w:after="0" w:line="240" w:lineRule="auto"/>
-        <w:ind w:right="9264"/>
+        <w:ind w:right="8930"/>
         <w:pBdr>
           <w:top w:val="single" w:sz="18" w:space="0" w:color="0D0D0D"/>
         </w:pBdr>
@@ -368,7 +368,7 @@
     <w:p>
       <w:pPr>
         <w:spacing w:before="130" w:after="0" w:line="240" w:lineRule="auto"/>
-        <w:ind w:right="9264"/>
+        <w:ind w:right="8930"/>
         <w:pBdr>
           <w:top w:val="single" w:sz="18" w:space="0" w:color="0D0D0D"/>
         </w:pBdr>
@@ -404,7 +404,7 @@
         <w:keepNext/>
         <w:keepLines/>
         <w:tabs>
-          <w:tab w:pos="10511" w:val="right"/>
+          <w:tab w:pos="10177" w:val="right"/>
         </w:tabs>
         <w:spacing w:before="0" w:after="0" w:line="266" w:lineRule="auto"/>
       </w:pPr>
@@ -646,7 +646,7 @@
         <w:keepNext/>
         <w:keepLines/>
         <w:tabs>
-          <w:tab w:pos="10511" w:val="right"/>
+          <w:tab w:pos="10177" w:val="right"/>
         </w:tabs>
         <w:spacing w:before="130" w:after="0" w:line="266" w:lineRule="auto"/>
       </w:pPr>
@@ -998,7 +998,7 @@
         <w:keepLines/>
         <w:pageBreakBefore/>
         <w:tabs>
-          <w:tab w:pos="10511" w:val="right"/>
+          <w:tab w:pos="10177" w:val="right"/>
         </w:tabs>
         <w:spacing w:before="130" w:after="0" w:line="266" w:lineRule="auto"/>
       </w:pPr>
@@ -1149,7 +1149,7 @@
         <w:keepNext/>
         <w:keepLines/>
         <w:tabs>
-          <w:tab w:pos="10511" w:val="right"/>
+          <w:tab w:pos="10177" w:val="right"/>
         </w:tabs>
         <w:spacing w:before="130" w:after="0" w:line="266" w:lineRule="auto"/>
       </w:pPr>
@@ -1389,7 +1389,7 @@
     <w:p>
       <w:pPr>
         <w:spacing w:before="130" w:after="0" w:line="240" w:lineRule="auto"/>
-        <w:ind w:right="9264"/>
+        <w:ind w:right="8930"/>
         <w:pBdr>
           <w:top w:val="single" w:sz="18" w:space="0" w:color="0D0D0D"/>
         </w:pBdr>
@@ -1425,7 +1425,7 @@
         <w:keepNext/>
         <w:keepLines/>
         <w:tabs>
-          <w:tab w:pos="10511" w:val="right"/>
+          <w:tab w:pos="10177" w:val="right"/>
         </w:tabs>
         <w:spacing w:before="0" w:after="0" w:line="266" w:lineRule="auto"/>
       </w:pPr>
@@ -1475,7 +1475,7 @@
         <w:keepNext/>
         <w:keepLines/>
         <w:tabs>
-          <w:tab w:pos="10511" w:val="right"/>
+          <w:tab w:pos="10177" w:val="right"/>
         </w:tabs>
         <w:spacing w:before="160" w:after="0" w:line="266" w:lineRule="auto"/>
       </w:pPr>
@@ -1525,7 +1525,7 @@
         <w:keepNext/>
         <w:keepLines/>
         <w:tabs>
-          <w:tab w:pos="10511" w:val="right"/>
+          <w:tab w:pos="10177" w:val="right"/>
         </w:tabs>
         <w:spacing w:before="160" w:after="0" w:line="266" w:lineRule="auto"/>
       </w:pPr>
@@ -1573,7 +1573,7 @@
     <w:p>
       <w:pPr>
         <w:spacing w:before="130" w:after="0" w:line="240" w:lineRule="auto"/>
-        <w:ind w:right="9264"/>
+        <w:ind w:right="8930"/>
         <w:pBdr>
           <w:top w:val="single" w:sz="18" w:space="0" w:color="0D0D0D"/>
         </w:pBdr>
@@ -1724,7 +1724,7 @@
     <w:p>
       <w:pPr>
         <w:spacing w:before="130" w:after="0" w:line="240" w:lineRule="auto"/>
-        <w:ind w:right="9264"/>
+        <w:ind w:right="8930"/>
         <w:pBdr>
           <w:top w:val="single" w:sz="18" w:space="0" w:color="0D0D0D"/>
         </w:pBdr>
@@ -1887,7 +1887,7 @@
     <w:p>
       <w:pPr>
         <w:spacing w:before="130" w:after="0" w:line="240" w:lineRule="auto"/>
-        <w:ind w:right="9264"/>
+        <w:ind w:right="8930"/>
         <w:pBdr>
           <w:top w:val="single" w:sz="18" w:space="0" w:color="0D0D0D"/>
         </w:pBdr>
@@ -1997,7 +1997,7 @@
       </w:r>
     </w:p>
     <w:sectPr>
-      <w:pgSz w:w="12240" w:h="15840"/>
+      <w:pgSz w:w="11906" w:h="16838"/>
       <w:pgMar w:top="539" w:right="822" w:bottom="425" w:left="907" w:header="720" w:footer="720" w:gutter="0"/>
       <w:cols w:space="720"/>
       <w:docGrid w:linePitch="360"/>

</xml_diff>